<commit_message>
fix(shvdn3): clarify cart limits and finalize workflow review
</commit_message>
<xml_diff>
--- a/docs/releases/v0.3.3.2-shvdn3-supplier-workflow/GlassHeroesBusiness_v0.3.3.2_SHVDN3_supplier_workflow_Developer_Report.docx
+++ b/docs/releases/v0.3.3.2-shvdn3-supplier-workflow/GlassHeroesBusiness_v0.3.3.2_SHVDN3_supplier_workflow_Developer_Report.docx
@@ -156,7 +156,7 @@
     </w:p>
     <w:p>
       <w:r>
-        <w:t>Build Supplier Order: highlight Universal Parts, Service Filters, Brake Kits or Diagnostic Supplies. LEFT removes one; RIGHT or ENTER adds one; controller D-pad matches. Each quantity clamps 0–100; one submitted order totals 1–100 units and must fit actual aggregate storage plus a free parcel slot. Up/down changes row. Choose one supplier, inspect Cost / Capacity Preview, then explicitly Place Purchase Order. Fill Low-stock Cart uses existing thresholds to prepare quantities only; Clear Cart changes no saved order or stock. Unsubmitted draft quantities are session-only and disappear on reload, as described in the menu.</w:t>
+        <w:t>Build Supplier Order: highlight Universal Parts, Service Filters, Brake Kits or Diagnostic Supplies. LEFT removes one; RIGHT or ENTER adds one; controller D-pad matches. Each quantity clamps 0–100; one submitted order totals 1–100 units and must fit actual aggregate storage plus a free parcel slot. Up/down changes row. Choose one supplier, inspect Cost / Capacity Preview, then explicitly Place Purchase Order. An over-limit draft shows OVER LIMIT instead of a misleading zero-dollar preview. Fill Low-stock Cart uses existing thresholds to prepare quantities only; Clear Cart changes no saved order or stock. Unsubmitted draft quantities are session-only and disappear on reload, as described in the menu.</w:t>
       </w:r>
     </w:p>
     <w:p>
@@ -302,7 +302,7 @@
     </w:p>
     <w:p>
       <w:r>
-        <w:t>Executable source: experimental/shvdn3/Install/scripts/GlassHeroesBusiness.3.cs; net48/C#7.3 project links that exact one file and pins official ScriptHookVDotNet3 3.6.0. Focused 01/02/03/04-source.diff and stage guides/build logs cover each isolated commit. Full source.diff reconstructs this candidate from b777c64. preservation.json records the reviewed method change list; unchanged Save payload and constructor behavior are enforced except for the one cart serializer/loader call, and original v2 hashes/repair/sales/wage methods are protected. Input tests deliberately move the old Escape-as-Back expectation to Backspace and add the new native pause contract without weakening accept/repeat guards.</w:t>
+        <w:t>Executable source: experimental/shvdn3/Install/scripts/GlassHeroesBusiness.3.cs; net48/C#7.3 project links that exact one file and pins official ScriptHookVDotNet3 3.6.0. Focused 01/02/03/04/05-source.diff and stage guides/build logs cover each isolated commit. Full source.diff reconstructs this candidate from b777c64. preservation.json records the reviewed method change list; unchanged Save payload and constructor behavior are enforced except for the one cart serializer/loader call, and original v2 hashes/repair/sales/wage methods are protected. Input tests deliberately move the old Escape-as-Back expectation to Backspace and add the new native pause contract without weakening accept/repeat guards.</w:t>
       </w:r>
     </w:p>
     <w:p>
@@ -452,7 +452,7 @@
     </w:p>
     <w:p>
       <w:r>
-        <w:t>Source SHA256: e50e9bba4889ab7670514e238dbf250ad9d38ced5d4e9cb8f0bd6ca64606e5ed. The complete unified source.diff applies to parent b777c64da7fc64241a2ac175b4013ff40cc864ec and reproduces this source exactly.</w:t>
+        <w:t>Source SHA256: de2b07413870de4e61befc517682fbc3d03afea8df5f80a5c45a583e65ee5194. The complete unified source.diff applies to parent b777c64da7fc64241a2ac175b4013ff40cc864ec and reproduces this source exactly.</w:t>
       </w:r>
     </w:p>
     <w:p>

</xml_diff>